<commit_message>
Update resume: NCSC title, current phone number, portfolio hyperlink
Resume summary now credits the NCSC Project Development Officer III
role, phone number matches the portfolio page, and the header's
"Portfolio link" text is a real hyperlink to eca-client.runasp.net/developer.
</commit_message>
<xml_diff>
--- a/EcaInformationSystem.Client/wwwroot/files/Lance_Andrei_Espina_Resume.docx
+++ b/EcaInformationSystem.Client/wwwroot/files/Lance_Andrei_Espina_Resume.docx
@@ -65,7 +65,7 @@
           <w:rPr>
             <w:rStyle w:val="Hyperlink"/>
           </w:rPr>
-          <w:t>eca-client.runasp.net</w:t>
+          <w:t>Portfolio link</w:t>
         </w:r>
       </w:hyperlink>
     </w:p>
@@ -2332,7 +2332,7 @@
 <file path=word/numbering.xml><?xml version="1.0" encoding="utf-8"?>
 <w:numbering xmlns:wpc="http://schemas.microsoft.com/office/word/2010/wordprocessingCanvas" xmlns:cx="http://schemas.microsoft.com/office/drawing/2014/chartex" xmlns:cx1="http://schemas.microsoft.com/office/drawing/2015/9/8/chartex" xmlns:cx2="http://schemas.microsoft.com/office/drawing/2015/10/21/chartex" xmlns:cx3="http://schemas.microsoft.com/office/drawing/2016/5/9/chartex" xmlns:cx4="http://schemas.microsoft.com/office/drawing/2016/5/10/chartex" xmlns:cx5="http://schemas.microsoft.com/office/drawing/2016/5/11/chartex" xmlns:cx6="http://schemas.microsoft.com/office/drawing/2016/5/12/chartex" xmlns:cx7="http://schemas.microsoft.com/office/drawing/2016/5/13/chartex" xmlns:cx8="http://schemas.microsoft.com/office/drawing/2016/5/14/chartex" xmlns:mc="http://schemas.openxmlformats.org/markup-compatibility/2006" xmlns:aink="http://schemas.microsoft.com/office/drawing/2016/ink" xmlns:am3d="http://schemas.microsoft.com/office/drawing/2017/model3d" xmlns:o="urn:schemas-microsoft-com:office:office" xmlns:oel="http://schemas.microsoft.com/office/2019/extlst" xmlns:r="http://schemas.openxmlformats.org/officeDocument/2006/relationships" xmlns:m="http://schemas.openxmlformats.org/officeDocument/2006/math" xmlns:v="urn:schemas-microsoft-com:vml" xmlns:wp14="http://schemas.microsoft.com/office/word/2010/wordprocessingDrawing" xmlns:wp="http://schemas.openxmlformats.org/drawingml/2006/wordprocessingDrawing" xmlns:w10="urn:schemas-microsoft-com:office:word" xmlns:w="http://schemas.openxmlformats.org/wordprocessingml/2006/main" xmlns:w14="http://schemas.microsoft.com/office/word/2010/wordml" xmlns:w15="http://schemas.microsoft.com/office/word/2012/wordml" xmlns:w16cex="http://schemas.microsoft.com/office/word/2018/wordml/cex" xmlns:w16cid="http://schemas.microsoft.com/office/word/2016/wordml/cid" xmlns:w16="http://schemas.microsoft.com/office/word/2018/wordml" xmlns:w16du="http://schemas.microsoft.com/office/word/2023/wordml/word16du" xmlns:w16sdtdh="http://schemas.microsoft.com/office/word/2020/wordml/sdtdatahash" xmlns:w16sdtfl="http://schemas.microsoft.com/office/word/2024/wordml/sdtformatlock" xmlns:w16se="http://schemas.microsoft.com/office/word/2015/wordml/symex" xmlns:wpg="http://schemas.microsoft.com/office/word/2010/wordprocessingGroup" xmlns:wpi="http://schemas.microsoft.com/office/word/2010/wordprocessingInk" xmlns:wne="http://schemas.microsoft.com/office/word/2006/wordml" xmlns:wps="http://schemas.microsoft.com/office/word/2010/wordprocessingShape" mc:Ignorable="w14 w15 w16se w16cid w16 w16cex w16sdtdh w16sdtfl w16du wp14">
   <w:abstractNum w:abstractNumId="0" w15:restartNumberingAfterBreak="0">
-    <w:nsid w:val="4E956FC2"/>
+    <w:nsid w:val="13A60A73"/>
     <w:multiLevelType w:val="singleLevel"/>
     <w:tmpl w:val="04090001"/>
     <w:lvl w:ilvl="0">
@@ -2349,7 +2349,7 @@
     </w:lvl>
   </w:abstractNum>
   <w:abstractNum w:abstractNumId="1" w15:restartNumberingAfterBreak="0">
-    <w:nsid w:val="77A544AE"/>
+    <w:nsid w:val="61B63DC8"/>
     <w:multiLevelType w:val="singleLevel"/>
     <w:tmpl w:val="04090001"/>
     <w:lvl w:ilvl="0">
@@ -2366,7 +2366,7 @@
     </w:lvl>
   </w:abstractNum>
   <w:abstractNum w:abstractNumId="2" w15:restartNumberingAfterBreak="0">
-    <w:nsid w:val="7EBF3B75"/>
+    <w:nsid w:val="753B2338"/>
     <w:multiLevelType w:val="singleLevel"/>
     <w:tmpl w:val="04090001"/>
     <w:lvl w:ilvl="0">
@@ -2382,14 +2382,14 @@
       </w:rPr>
     </w:lvl>
   </w:abstractNum>
-  <w:num w:numId="1" w16cid:durableId="1182620330">
+  <w:num w:numId="1" w16cid:durableId="361899282">
+    <w:abstractNumId w:val="1"/>
+  </w:num>
+  <w:num w:numId="2" w16cid:durableId="1165440703">
     <w:abstractNumId w:val="2"/>
   </w:num>
-  <w:num w:numId="2" w16cid:durableId="1341544605">
+  <w:num w:numId="3" w16cid:durableId="673266351">
     <w:abstractNumId w:val="0"/>
-  </w:num>
-  <w:num w:numId="3" w16cid:durableId="516700413">
-    <w:abstractNumId w:val="1"/>
   </w:num>
 </w:numbering>
 </file>
@@ -2802,7 +2802,7 @@
     <w:link w:val="Heading1Char"/>
     <w:uiPriority w:val="9"/>
     <w:qFormat/>
-    <w:rsid w:val="00730994"/>
+    <w:rsid w:val="00444C8C"/>
     <w:pPr>
       <w:keepNext/>
       <w:keepLines/>
@@ -2825,7 +2825,7 @@
     <w:semiHidden/>
     <w:unhideWhenUsed/>
     <w:qFormat/>
-    <w:rsid w:val="00730994"/>
+    <w:rsid w:val="00444C8C"/>
     <w:pPr>
       <w:keepNext/>
       <w:keepLines/>
@@ -2848,7 +2848,7 @@
     <w:semiHidden/>
     <w:unhideWhenUsed/>
     <w:qFormat/>
-    <w:rsid w:val="00730994"/>
+    <w:rsid w:val="00444C8C"/>
     <w:pPr>
       <w:keepNext/>
       <w:keepLines/>
@@ -2871,7 +2871,7 @@
     <w:semiHidden/>
     <w:unhideWhenUsed/>
     <w:qFormat/>
-    <w:rsid w:val="00730994"/>
+    <w:rsid w:val="00444C8C"/>
     <w:pPr>
       <w:keepNext/>
       <w:keepLines/>
@@ -2894,7 +2894,7 @@
     <w:semiHidden/>
     <w:unhideWhenUsed/>
     <w:qFormat/>
-    <w:rsid w:val="00730994"/>
+    <w:rsid w:val="00444C8C"/>
     <w:pPr>
       <w:keepNext/>
       <w:keepLines/>
@@ -2915,7 +2915,7 @@
     <w:semiHidden/>
     <w:unhideWhenUsed/>
     <w:qFormat/>
-    <w:rsid w:val="00730994"/>
+    <w:rsid w:val="00444C8C"/>
     <w:pPr>
       <w:keepNext/>
       <w:keepLines/>
@@ -2938,7 +2938,7 @@
     <w:semiHidden/>
     <w:unhideWhenUsed/>
     <w:qFormat/>
-    <w:rsid w:val="00730994"/>
+    <w:rsid w:val="00444C8C"/>
     <w:pPr>
       <w:keepNext/>
       <w:keepLines/>
@@ -2959,7 +2959,7 @@
     <w:semiHidden/>
     <w:unhideWhenUsed/>
     <w:qFormat/>
-    <w:rsid w:val="00730994"/>
+    <w:rsid w:val="00444C8C"/>
     <w:pPr>
       <w:keepNext/>
       <w:keepLines/>
@@ -2982,7 +2982,7 @@
     <w:semiHidden/>
     <w:unhideWhenUsed/>
     <w:qFormat/>
-    <w:rsid w:val="00730994"/>
+    <w:rsid w:val="00444C8C"/>
     <w:pPr>
       <w:keepNext/>
       <w:keepLines/>
@@ -3026,7 +3026,7 @@
     <w:basedOn w:val="DefaultParagraphFont"/>
     <w:link w:val="Heading1"/>
     <w:uiPriority w:val="9"/>
-    <w:rsid w:val="00730994"/>
+    <w:rsid w:val="00444C8C"/>
     <w:rPr>
       <w:rFonts w:asciiTheme="majorHAnsi" w:eastAsiaTheme="majorEastAsia" w:hAnsiTheme="majorHAnsi" w:cstheme="majorBidi"/>
       <w:color w:val="2F5496" w:themeColor="accent1" w:themeShade="BF"/>
@@ -3040,7 +3040,7 @@
     <w:link w:val="Heading2"/>
     <w:uiPriority w:val="9"/>
     <w:semiHidden/>
-    <w:rsid w:val="00730994"/>
+    <w:rsid w:val="00444C8C"/>
     <w:rPr>
       <w:rFonts w:asciiTheme="majorHAnsi" w:eastAsiaTheme="majorEastAsia" w:hAnsiTheme="majorHAnsi" w:cstheme="majorBidi"/>
       <w:color w:val="2F5496" w:themeColor="accent1" w:themeShade="BF"/>
@@ -3054,7 +3054,7 @@
     <w:link w:val="Heading3"/>
     <w:uiPriority w:val="9"/>
     <w:semiHidden/>
-    <w:rsid w:val="00730994"/>
+    <w:rsid w:val="00444C8C"/>
     <w:rPr>
       <w:rFonts w:eastAsiaTheme="majorEastAsia" w:cstheme="majorBidi"/>
       <w:color w:val="2F5496" w:themeColor="accent1" w:themeShade="BF"/>
@@ -3068,7 +3068,7 @@
     <w:link w:val="Heading4"/>
     <w:uiPriority w:val="9"/>
     <w:semiHidden/>
-    <w:rsid w:val="00730994"/>
+    <w:rsid w:val="00444C8C"/>
     <w:rPr>
       <w:rFonts w:eastAsiaTheme="majorEastAsia" w:cstheme="majorBidi"/>
       <w:i/>
@@ -3082,7 +3082,7 @@
     <w:link w:val="Heading5"/>
     <w:uiPriority w:val="9"/>
     <w:semiHidden/>
-    <w:rsid w:val="00730994"/>
+    <w:rsid w:val="00444C8C"/>
     <w:rPr>
       <w:rFonts w:eastAsiaTheme="majorEastAsia" w:cstheme="majorBidi"/>
       <w:color w:val="2F5496" w:themeColor="accent1" w:themeShade="BF"/>
@@ -3094,7 +3094,7 @@
     <w:link w:val="Heading6"/>
     <w:uiPriority w:val="9"/>
     <w:semiHidden/>
-    <w:rsid w:val="00730994"/>
+    <w:rsid w:val="00444C8C"/>
     <w:rPr>
       <w:rFonts w:eastAsiaTheme="majorEastAsia" w:cstheme="majorBidi"/>
       <w:i/>
@@ -3108,7 +3108,7 @@
     <w:link w:val="Heading7"/>
     <w:uiPriority w:val="9"/>
     <w:semiHidden/>
-    <w:rsid w:val="00730994"/>
+    <w:rsid w:val="00444C8C"/>
     <w:rPr>
       <w:rFonts w:eastAsiaTheme="majorEastAsia" w:cstheme="majorBidi"/>
       <w:color w:val="595959" w:themeColor="text1" w:themeTint="A6"/>
@@ -3120,7 +3120,7 @@
     <w:link w:val="Heading8"/>
     <w:uiPriority w:val="9"/>
     <w:semiHidden/>
-    <w:rsid w:val="00730994"/>
+    <w:rsid w:val="00444C8C"/>
     <w:rPr>
       <w:rFonts w:eastAsiaTheme="majorEastAsia" w:cstheme="majorBidi"/>
       <w:i/>
@@ -3134,7 +3134,7 @@
     <w:link w:val="Heading9"/>
     <w:uiPriority w:val="9"/>
     <w:semiHidden/>
-    <w:rsid w:val="00730994"/>
+    <w:rsid w:val="00444C8C"/>
     <w:rPr>
       <w:rFonts w:eastAsiaTheme="majorEastAsia" w:cstheme="majorBidi"/>
       <w:color w:val="272727" w:themeColor="text1" w:themeTint="D8"/>
@@ -3147,7 +3147,7 @@
     <w:link w:val="TitleChar"/>
     <w:uiPriority w:val="10"/>
     <w:qFormat/>
-    <w:rsid w:val="00730994"/>
+    <w:rsid w:val="00444C8C"/>
     <w:pPr>
       <w:spacing w:after="80" w:line="240" w:lineRule="auto"/>
       <w:contextualSpacing/>
@@ -3165,7 +3165,7 @@
     <w:basedOn w:val="DefaultParagraphFont"/>
     <w:link w:val="Title"/>
     <w:uiPriority w:val="10"/>
-    <w:rsid w:val="00730994"/>
+    <w:rsid w:val="00444C8C"/>
     <w:rPr>
       <w:rFonts w:asciiTheme="majorHAnsi" w:eastAsiaTheme="majorEastAsia" w:hAnsiTheme="majorHAnsi" w:cstheme="majorBidi"/>
       <w:spacing w:val="-10"/>
@@ -3181,7 +3181,7 @@
     <w:link w:val="SubtitleChar"/>
     <w:uiPriority w:val="11"/>
     <w:qFormat/>
-    <w:rsid w:val="00730994"/>
+    <w:rsid w:val="00444C8C"/>
     <w:pPr>
       <w:numPr>
         <w:ilvl w:val="1"/>
@@ -3200,7 +3200,7 @@
     <w:basedOn w:val="DefaultParagraphFont"/>
     <w:link w:val="Subtitle"/>
     <w:uiPriority w:val="11"/>
-    <w:rsid w:val="00730994"/>
+    <w:rsid w:val="00444C8C"/>
     <w:rPr>
       <w:rFonts w:eastAsiaTheme="majorEastAsia" w:cstheme="majorBidi"/>
       <w:color w:val="595959" w:themeColor="text1" w:themeTint="A6"/>
@@ -3216,7 +3216,7 @@
     <w:link w:val="QuoteChar"/>
     <w:uiPriority w:val="29"/>
     <w:qFormat/>
-    <w:rsid w:val="00730994"/>
+    <w:rsid w:val="00444C8C"/>
     <w:pPr>
       <w:spacing w:before="160"/>
       <w:jc w:val="center"/>
@@ -3232,7 +3232,7 @@
     <w:basedOn w:val="DefaultParagraphFont"/>
     <w:link w:val="Quote"/>
     <w:uiPriority w:val="29"/>
-    <w:rsid w:val="00730994"/>
+    <w:rsid w:val="00444C8C"/>
     <w:rPr>
       <w:i/>
       <w:iCs/>
@@ -3244,7 +3244,7 @@
     <w:basedOn w:val="Normal"/>
     <w:uiPriority w:val="34"/>
     <w:qFormat/>
-    <w:rsid w:val="00730994"/>
+    <w:rsid w:val="00444C8C"/>
     <w:pPr>
       <w:ind w:left="720"/>
       <w:contextualSpacing/>
@@ -3255,7 +3255,7 @@
     <w:basedOn w:val="DefaultParagraphFont"/>
     <w:uiPriority w:val="21"/>
     <w:qFormat/>
-    <w:rsid w:val="00730994"/>
+    <w:rsid w:val="00444C8C"/>
     <w:rPr>
       <w:i/>
       <w:iCs/>
@@ -3269,7 +3269,7 @@
     <w:link w:val="IntenseQuoteChar"/>
     <w:uiPriority w:val="30"/>
     <w:qFormat/>
-    <w:rsid w:val="00730994"/>
+    <w:rsid w:val="00444C8C"/>
     <w:pPr>
       <w:pBdr>
         <w:top w:val="single" w:sz="4" w:space="10" w:color="2F5496" w:themeColor="accent1" w:themeShade="BF"/>
@@ -3290,7 +3290,7 @@
     <w:basedOn w:val="DefaultParagraphFont"/>
     <w:link w:val="IntenseQuote"/>
     <w:uiPriority w:val="30"/>
-    <w:rsid w:val="00730994"/>
+    <w:rsid w:val="00444C8C"/>
     <w:rPr>
       <w:i/>
       <w:iCs/>
@@ -3302,7 +3302,7 @@
     <w:basedOn w:val="DefaultParagraphFont"/>
     <w:uiPriority w:val="32"/>
     <w:qFormat/>
-    <w:rsid w:val="00730994"/>
+    <w:rsid w:val="00444C8C"/>
     <w:rPr>
       <w:b/>
       <w:bCs/>
@@ -3316,7 +3316,7 @@
     <w:basedOn w:val="DefaultParagraphFont"/>
     <w:uiPriority w:val="99"/>
     <w:unhideWhenUsed/>
-    <w:rsid w:val="00730994"/>
+    <w:rsid w:val="00444C8C"/>
     <w:rPr>
       <w:color w:val="0563C1" w:themeColor="hyperlink"/>
       <w:u w:val="single"/>
@@ -3328,7 +3328,7 @@
     <w:uiPriority w:val="99"/>
     <w:semiHidden/>
     <w:unhideWhenUsed/>
-    <w:rsid w:val="00730994"/>
+    <w:rsid w:val="00444C8C"/>
     <w:rPr>
       <w:color w:val="605E5C"/>
       <w:shd w:val="clear" w:color="auto" w:fill="E1DFDD"/>

</xml_diff>